<commit_message>
Refactor project documentation and update report for License Plate Recognition service
- Updated README.md to reflect new project focus on License Plate Recognition, including detailed model descriptions and usage instructions.
- Enhanced generate_report.py to align with the new project scope, including changes to headings, abstract, team roles, and system architecture.
- Improved clarity in the explanation of the cascaded detection and OCR pipeline.
- Added detailed results and examples for each model, including status updates and performance metrics.
- Revised conclusion to summarize key outcomes and future steps for the project.
</commit_message>
<xml_diff>
--- a/Project_Report.docx
+++ b/Project_Report.docx
@@ -8,7 +8,7 @@
         <w:jc w:val="center"/>
       </w:pPr>
       <w:r>
-        <w:t>CV FastAPI — Computer Vision Service</w:t>
+        <w:t>CV FastAPI — License Plate Recognition</w:t>
       </w:r>
     </w:p>
     <w:p>
@@ -20,7 +20,7 @@
           <w:i/>
           <w:sz w:val="26"/>
         </w:rPr>
-        <w:t>Object Detection &amp; License Plate Recognition</w:t>
+        <w:t>Cascaded Detection + OCR Pipeline</w:t>
         <w:br/>
         <w:t>Final Project Report</w:t>
       </w:r>
@@ -50,7 +50,7 @@
     </w:p>
     <w:p>
       <w:r>
-        <w:t>This project presents CV FastAPI — a unified computer vision web service that combines five deep learning models under a single FastAPI backend. The system performs two related tasks: (1) object detection on uploaded images, and (2) optical character recognition (OCR) on the detected regions, with a particular focus on license plate reading. The work was distributed among four team members, each responsible for a distinct machine learning component: single-stage anchor-free detection (YOLO family), two-stage region-proposal detection (Faster R-CNN), single-shot multibox detection (SSDLite), and convolutional-recurrent text recognition (CRNN + CTC) with an EasyOCR baseline. Three of the five models are fully operational in end-to-end inference; the remaining two are loaded from state-dicts and verified at the architecture level.</w:t>
+        <w:t>This project presents CV FastAPI — a computer vision web service for license plate recognition. The system combines five deep-learning models into a single cascaded pipeline: a general object detector (YOLOv8n / YOLO26n) finds vehicles, a specialised plate detector (Faster R-CNN v2, with SSDLite v2 as an alternative) localises license plates inside each vehicle, and two OCR engines run in parallel to read the plate text — a custom CRNN trained with CTC loss as our own solution, and EasyOCR as a library baseline. The work was distributed among four team members, each owning a distinct ML component. Three detection models and both OCR engines are fully operational end-to-end; SSDLite is loaded from the saved state-dict and architecturally verified.</w:t>
       </w:r>
     </w:p>
     <w:p>
@@ -149,7 +149,7 @@
           </w:tcPr>
           <w:p>
             <w:r>
-              <w:t>Single-stage detectors. Integrated the Ultralytics YOLO pipeline, tuned confidence thresholds, validated end-to-end inference, and benchmarked speed on CPU.</w:t>
+              <w:t>Vehicle-detection stage of the cascade. Integrated Ultralytics YOLO, filtered predictions to COCO vehicle classes (car / motorcycle / bus / truck), implemented the cascade hand-off to the plate detector and the fallback path when no vehicles are found.</w:t>
             </w:r>
           </w:p>
         </w:tc>
@@ -181,7 +181,7 @@
           </w:tcPr>
           <w:p>
             <w:r>
-              <w:t>Two-stage detector. Rebuilt the torchvision architecture, replaced the FastRCNNPredictor head with a custom 2-class head, loaded the trained state-dict, and tuned the score threshold and NMS IoU.</w:t>
+              <w:t>Plate-detection stage — the production model. Rebuilt the torchvision architecture, replaced the FastRCNNPredictor head with a custom 2-class head, loaded the trained weights, and tuned the score / NMS thresholds. Used both standalone and inside the YOLO cascade.</w:t>
             </w:r>
           </w:p>
         </w:tc>
@@ -213,7 +213,7 @@
           </w:tcPr>
           <w:p>
             <w:r>
-              <w:t>Single-shot detector. Wrote the build_ssdlite() factory: extracts the per-feature-map input channels, computes the number of anchors per location, and rebuilds the SSDLiteClassificationHead with the correct BatchNorm parameters before loading weights.</w:t>
+              <w:t>Alternative plate detector. Wrote the build_ssdlite() factory: extracts per-feature-map channels, queries the anchor generator, and rebuilds the SSDLiteClassificationHead with matching BatchNorm parameters before the trained state-dict can load.</w:t>
             </w:r>
           </w:p>
         </w:tc>
@@ -245,7 +245,7 @@
           </w:tcPr>
           <w:p>
             <w:r>
-              <w:t>Optical character recognition. Implemented a CNN→BiLSTM→FC network trained with CTC loss over a 37-symbol alphabet, wrote the preprocessing and greedy CTC decoder, and integrated EasyOCR as a comparison baseline.</w:t>
+              <w:t>Text recognition. Implemented a CNN→BiLSTM→FC network trained with CTC, the greedy CTC decoder, and the OCR-side preprocessing (autocontrast, sharpening, upscaling for tiny crops). Tuned EasyOCR with a plate alphabet allowlist and left-to-right fragment merging.</w:t>
             </w:r>
           </w:p>
         </w:tc>
@@ -257,7 +257,7 @@
         <w:pStyle w:val="IntenseQuote"/>
       </w:pPr>
       <w:r>
-        <w:t>Backend (FastAPI server, REST endpoints, request handling) and the web interface (HTML + Bootstrap + JavaScript) were developed jointly by all four members in parallel with their ML work, so that each could test their model in the unified inference pipeline.</w:t>
+        <w:t>The FastAPI server (REST endpoints, request handling) and the web interface (Bootstrap + custom license-plate UI) were developed jointly by all four members in parallel with their ML work, so each could test their model in the unified inference pipeline.</w:t>
       </w:r>
     </w:p>
     <w:p>
@@ -268,141 +268,65 @@
         <w:rPr>
           <w:rFonts w:ascii="Calibri" w:hAnsi="Calibri"/>
         </w:rPr>
-        <w:t>2. Member 1 — YOLOv8n &amp; YOLO26n (Single-Stage Detection)</w:t>
+        <w:t>2. System Architecture — Cascaded Pipeline</w:t>
+      </w:r>
+    </w:p>
+    <w:p>
+      <w:r>
+        <w:t>When the user selects a YOLO detector in the UI, the request flows through a two-stage cascade:</w:t>
       </w:r>
     </w:p>
     <w:p>
       <w:pPr>
-        <w:pStyle w:val="Heading2"/>
+        <w:pStyle w:val="ListNumber"/>
       </w:pPr>
       <w:r>
-        <w:rPr>
-          <w:rFonts w:ascii="Calibri" w:hAnsi="Calibri"/>
-        </w:rPr>
-        <w:t>2.1 Approach</w:t>
+        <w:t>YOLO runs on the full image and is filtered to COCO vehicle classes only (2 = car, 3 = motorcycle, 5 = bus, 7 = truck).</w:t>
+      </w:r>
+    </w:p>
+    <w:p>
+      <w:pPr>
+        <w:pStyle w:val="ListNumber"/>
+      </w:pPr>
+      <w:r>
+        <w:t>For each detected vehicle bbox, the image is cropped and Faster R-CNN v2 runs on that crop to localise license plates.</w:t>
+      </w:r>
+    </w:p>
+    <w:p>
+      <w:pPr>
+        <w:pStyle w:val="ListNumber"/>
+      </w:pPr>
+      <w:r>
+        <w:t>Plate coordinates are translated back into the original image space.</w:t>
+      </w:r>
+    </w:p>
+    <w:p>
+      <w:pPr>
+        <w:pStyle w:val="ListNumber"/>
+      </w:pPr>
+      <w:r>
+        <w:t>Each plate crop is expanded (~8 % horizontally, ~12 % vertically) and enhanced (autocontrast + sharpen + upscale to ≥48 px height).</w:t>
+      </w:r>
+    </w:p>
+    <w:p>
+      <w:pPr>
+        <w:pStyle w:val="ListNumber"/>
+      </w:pPr>
+      <w:r>
+        <w:t>Each crop is sent through the chosen OCR engine — CRNN (custom), EasyOCR (library), or both — and the results are drawn on the image and returned as JSON.</w:t>
+      </w:r>
+    </w:p>
+    <w:p>
+      <w:pPr>
+        <w:pStyle w:val="ListNumber"/>
+      </w:pPr>
+      <w:r>
+        <w:t>If YOLO finds no vehicles in step 1, the system automatically falls back to running Faster R-CNN on the full image — so single-plate close-up images still work.</w:t>
       </w:r>
     </w:p>
     <w:p>
       <w:r>
-        <w:t>YOLO (You Only Look Once) is an anchor-based, one-stage object detector that predicts bounding boxes and class probabilities directly from a single forward pass through a fully convolutional network. Two variants were integrated:</w:t>
-      </w:r>
-    </w:p>
-    <w:p>
-      <w:pPr>
-        <w:pStyle w:val="ListBullet"/>
-      </w:pPr>
-      <w:r>
-        <w:rPr>
-          <w:b/>
-        </w:rPr>
-        <w:t>YOLOv8n</w:t>
-      </w:r>
-      <w:r>
-        <w:t xml:space="preserve"> — the official Ultralytics nano model, ~3.2M parameters.</w:t>
-      </w:r>
-    </w:p>
-    <w:p>
-      <w:pPr>
-        <w:pStyle w:val="ListBullet"/>
-      </w:pPr>
-      <w:r>
-        <w:rPr>
-          <w:b/>
-        </w:rPr>
-        <w:t>YOLO26n</w:t>
-      </w:r>
-      <w:r>
-        <w:t xml:space="preserve"> — a newer-generation nano model from the same family.</w:t>
-      </w:r>
-    </w:p>
-    <w:p>
-      <w:pPr>
-        <w:pStyle w:val="Heading2"/>
-      </w:pPr>
-      <w:r>
-        <w:rPr>
-          <w:rFonts w:ascii="Calibri" w:hAnsi="Calibri"/>
-        </w:rPr>
-        <w:t>2.2 Implementation</w:t>
-      </w:r>
-    </w:p>
-    <w:p>
-      <w:r>
-        <w:t>Both models are loaded through the Ultralytics YOLO() class, which handles preprocessing, inference, and post-processing internally. The CVModelManager automatically detects YOLO weights by filename and routes them to this loader:</w:t>
-      </w:r>
-    </w:p>
-    <w:p>
-      <w:r>
-        <w:rPr>
-          <w:rFonts w:ascii="Consolas" w:hAnsi="Consolas"/>
-        </w:rPr>
-        <w:t>if 'yolo' in model_file.lower():</w:t>
-        <w:br/>
-        <w:t xml:space="preserve">    self.models[model_file] = YOLO(path)</w:t>
-        <w:br/>
-        <w:t>...</w:t>
-        <w:br/>
-        <w:t>results = model(image, conf=0.25)[0]</w:t>
-        <w:br/>
-        <w:t>boxes = results.boxes.xyxy.cpu().numpy().tolist()</w:t>
-      </w:r>
-    </w:p>
-    <w:p>
-      <w:pPr>
-        <w:pStyle w:val="Heading2"/>
-      </w:pPr>
-      <w:r>
-        <w:rPr>
-          <w:rFonts w:ascii="Calibri" w:hAnsi="Calibri"/>
-        </w:rPr>
-        <w:t>2.3 Results</w:t>
-      </w:r>
-    </w:p>
-    <w:p>
-      <w:r>
-        <w:t>Both YOLO models run inference end-to-end and return clean bounding boxes on test images. Confidence threshold of 0.25 produced the best balance between recall and false positives on the project test set.</w:t>
-      </w:r>
-    </w:p>
-    <w:p>
-      <w:pPr>
-        <w:pStyle w:val="ListBullet"/>
-      </w:pPr>
-      <w:r>
-        <w:rPr>
-          <w:b/>
-        </w:rPr>
-        <w:t xml:space="preserve">Status: </w:t>
-      </w:r>
-      <w:r>
-        <w:t>✅ Fully working</w:t>
-      </w:r>
-    </w:p>
-    <w:p>
-      <w:pPr>
-        <w:pStyle w:val="ListBullet"/>
-      </w:pPr>
-      <w:r>
-        <w:rPr>
-          <w:b/>
-        </w:rPr>
-        <w:t xml:space="preserve">Inference time (CPU): </w:t>
-      </w:r>
-      <w:r>
-        <w:t>~80–150 ms per image</w:t>
-      </w:r>
-    </w:p>
-    <w:p>
-      <w:pPr>
-        <w:pStyle w:val="ListBullet"/>
-      </w:pPr>
-      <w:r>
-        <w:rPr>
-          <w:b/>
-        </w:rPr>
-        <w:t xml:space="preserve">Output: </w:t>
-      </w:r>
-      <w:r>
-        <w:t>bounding boxes drawn in lime green, ready for OCR cropping</w:t>
+        <w:t>Selecting Faster R-CNN or SSDLite directly skips the YOLO stage and runs the plate detector on the full image. Selecting CRNN or EasyOCR as the model performs OCR only, treating the whole image as one crop.</w:t>
       </w:r>
     </w:p>
     <w:p>
@@ -413,7 +337,7 @@
         <w:rPr>
           <w:rFonts w:ascii="Calibri" w:hAnsi="Calibri"/>
         </w:rPr>
-        <w:t>3. Member 2 — Faster R-CNN v2 (Two-Stage Detection)</w:t>
+        <w:t>3. Member 1 — YOLOv8n &amp; YOLO26n (Vehicle Detection)</w:t>
       </w:r>
     </w:p>
     <w:p>
@@ -429,7 +353,35 @@
     </w:p>
     <w:p>
       <w:r>
-        <w:t>Faster R-CNN is a two-stage detector: a Region Proposal Network (RPN) first generates candidate object regions, then a second head classifies each region and refines its bounding box. The MobileNetV3-Large 320 FPN variant is used as a lightweight backbone with feature pyramid fusion.</w:t>
+        <w:t>YOLO is an anchor-based, single-stage object detector that predicts bounding boxes and class probabilities in one forward pass through a fully convolutional network. In our cascade YOLO is used not for plates directly (its COCO checkpoints don't contain a 'plate' class), but as a fast first-stage vehicle locator that narrows the search region for the more expensive plate detector.</w:t>
+      </w:r>
+    </w:p>
+    <w:p>
+      <w:pPr>
+        <w:pStyle w:val="ListBullet"/>
+      </w:pPr>
+      <w:r>
+        <w:rPr>
+          <w:b/>
+        </w:rPr>
+        <w:t>YOLOv8n</w:t>
+      </w:r>
+      <w:r>
+        <w:t xml:space="preserve"> — official Ultralytics nano model, ~3.2 M parameters.</w:t>
+      </w:r>
+    </w:p>
+    <w:p>
+      <w:pPr>
+        <w:pStyle w:val="ListBullet"/>
+      </w:pPr>
+      <w:r>
+        <w:rPr>
+          <w:b/>
+        </w:rPr>
+        <w:t>YOLO26n</w:t>
+      </w:r>
+      <w:r>
+        <w:t xml:space="preserve"> — newer-generation nano model from the same family.</w:t>
       </w:r>
     </w:p>
     <w:p>
@@ -445,30 +397,31 @@
     </w:p>
     <w:p>
       <w:r>
-        <w:t>The torchvision architecture is rebuilt with no pretrained weights, the classification head is replaced with a custom 2-class FastRCNNPredictor (background + plate), and the trained state-dict is loaded:</w:t>
+        <w:t>Both models are loaded through the Ultralytics YOLO() class. The CVModelManager auto-detects YOLO weights by filename. At inference time the prediction is filtered to vehicle classes only and handed off to the cascade:</w:t>
       </w:r>
     </w:p>
     <w:p>
       <w:r>
         <w:rPr>
           <w:rFonts w:ascii="Consolas" w:hAnsi="Consolas"/>
+          <w:sz w:val="18"/>
         </w:rPr>
-        <w:t>model = fasterrcnn_mobilenet_v3_large_320_fpn(</w:t>
+        <w:t>results = model(image, conf=0.25, classes=[2, 3, 5, 7])[0]</w:t>
         <w:br/>
-        <w:t xml:space="preserve">    weights=None, weights_backbone=None</w:t>
+        <w:t>vehicle_boxes = results.boxes.xyxy.cpu().numpy().tolist()</w:t>
         <w:br/>
-        <w:t>)</w:t>
         <w:br/>
-        <w:t>in_features = model.roi_heads.box_predictor.cls_score.in_features</w:t>
+        <w:t>plate_detector = self.models['frcnn_v2.pt']</w:t>
         <w:br/>
-        <w:t>model.roi_heads.box_predictor = FastRCNNPredictor(in_features, 2)</w:t>
+        <w:t>if vehicle_boxes:</w:t>
         <w:br/>
-        <w:t>model.load_state_dict(loaded, strict=False)</w:t>
-      </w:r>
-    </w:p>
-    <w:p>
-      <w:r>
-        <w:t>Post-processing applies a score threshold of 0.6 and NMS with IoU 0.4 to filter overlapping detections. Output is capped at 20 boxes per image to keep OCR latency bounded.</w:t>
+        <w:t xml:space="preserve">    boxes = self._cascade_plates(image, vehicle_boxes, plate_detector)</w:t>
+        <w:br/>
+        <w:t>else:</w:t>
+        <w:br/>
+        <w:t xml:space="preserve">    # fallback — no vehicles found</w:t>
+        <w:br/>
+        <w:t xml:space="preserve">    boxes = self._run_torchvision_boxes(image, plate_detector, thresh=0.6)</w:t>
       </w:r>
     </w:p>
     <w:p>
@@ -504,10 +457,10 @@
         <w:rPr>
           <w:b/>
         </w:rPr>
-        <w:t xml:space="preserve">Score threshold: </w:t>
+        <w:t xml:space="preserve">Confidence threshold: </w:t>
       </w:r>
       <w:r>
-        <w:t>0.6</w:t>
+        <w:t>0.25 (good recall on small / partial vehicles)</w:t>
       </w:r>
     </w:p>
     <w:p>
@@ -518,10 +471,10 @@
         <w:rPr>
           <w:b/>
         </w:rPr>
-        <w:t xml:space="preserve">NMS IoU: </w:t>
+        <w:t xml:space="preserve">Inference time (CPU): </w:t>
       </w:r>
       <w:r>
-        <w:t>0.4</w:t>
+        <w:t>~80–150 ms / image</w:t>
       </w:r>
     </w:p>
     <w:p>
@@ -532,10 +485,10 @@
         <w:rPr>
           <w:b/>
         </w:rPr>
-        <w:t xml:space="preserve">Output: </w:t>
+        <w:t xml:space="preserve">Pipeline log line: </w:t>
       </w:r>
       <w:r>
-        <w:t>bounding boxes drawn in red, higher precision than YOLO on small plates</w:t>
+        <w:t>"YOLO нашёл N ТС → FRCNN нашёл M номер(ов)" — surfaced to the UI in the prediction.pipeline field.</w:t>
       </w:r>
     </w:p>
     <w:p>
@@ -546,7 +499,7 @@
         <w:rPr>
           <w:rFonts w:ascii="Calibri" w:hAnsi="Calibri"/>
         </w:rPr>
-        <w:t>4. Member 3 — SSDLite v2 (Single-Shot Detection)</w:t>
+        <w:t>4. Member 2 — Faster R-CNN v2 (Plate Detection)</w:t>
       </w:r>
     </w:p>
     <w:p>
@@ -562,7 +515,7 @@
     </w:p>
     <w:p>
       <w:r>
-        <w:t>SSD (Single Shot MultiBox Detector) predicts bounding boxes from multiple feature-map scales in one forward pass. SSDLite replaces standard convolutions with depthwise-separable convolutions for mobile deployment.</w:t>
+        <w:t>Faster R-CNN is a two-stage detector: a Region Proposal Network (RPN) generates candidate object regions and a second head classifies each and refines its bounding box. The MobileNetV3-Large 320 FPN variant is a lightweight backbone with feature-pyramid fusion. In our system Faster R-CNN is the workhorse plate detector — used both directly and as the second stage of the YOLO cascade.</w:t>
       </w:r>
     </w:p>
     <w:p>
@@ -573,18 +526,139 @@
         <w:rPr>
           <w:rFonts w:ascii="Calibri" w:hAnsi="Calibri"/>
         </w:rPr>
-        <w:t>4.2 Implementation — the head-rebuild challenge</w:t>
+        <w:t>4.2 Implementation</w:t>
       </w:r>
     </w:p>
     <w:p>
       <w:r>
-        <w:t>The trained state-dict was produced for a 2-class problem (background + plate) but torchvision's SSDLite ships with a 91-class COCO head. Loading the state-dict directly fails because the classification head's shape mismatches. To fix this, a build_ssdlite() factory was written:</w:t>
+        <w:t>torchvision's architecture is rebuilt with no pretrained weights, the classification head is replaced with a custom 2-class FastRCNNPredictor (background + plate), and the trained state-dict is loaded:</w:t>
       </w:r>
     </w:p>
     <w:p>
       <w:r>
         <w:rPr>
           <w:rFonts w:ascii="Consolas" w:hAnsi="Consolas"/>
+          <w:sz w:val="18"/>
+        </w:rPr>
+        <w:t>model = fasterrcnn_mobilenet_v3_large_320_fpn(</w:t>
+        <w:br/>
+        <w:t xml:space="preserve">    weights=None, weights_backbone=None</w:t>
+        <w:br/>
+        <w:t>)</w:t>
+        <w:br/>
+        <w:t>in_features = model.roi_heads.box_predictor.cls_score.in_features</w:t>
+        <w:br/>
+        <w:t>model.roi_heads.box_predictor = FastRCNNPredictor(in_features, 2)</w:t>
+        <w:br/>
+        <w:t>model.load_state_dict(loaded, strict=False)</w:t>
+      </w:r>
+    </w:p>
+    <w:p>
+      <w:r>
+        <w:t>Post-processing applies a score threshold of 0.6 and NMS with IoU 0.4. Output is capped at 20 boxes per image. When called as the second stage of the cascade, the resulting plate coordinates are translated from the vehicle-crop frame back into the original image frame.</w:t>
+      </w:r>
+    </w:p>
+    <w:p>
+      <w:pPr>
+        <w:pStyle w:val="Heading2"/>
+      </w:pPr>
+      <w:r>
+        <w:rPr>
+          <w:rFonts w:ascii="Calibri" w:hAnsi="Calibri"/>
+        </w:rPr>
+        <w:t>4.3 Results</w:t>
+      </w:r>
+    </w:p>
+    <w:p>
+      <w:pPr>
+        <w:pStyle w:val="ListBullet"/>
+      </w:pPr>
+      <w:r>
+        <w:rPr>
+          <w:b/>
+        </w:rPr>
+        <w:t xml:space="preserve">Status: </w:t>
+      </w:r>
+      <w:r>
+        <w:t>✅ Fully working — both standalone and as cascade stage 2</w:t>
+      </w:r>
+    </w:p>
+    <w:p>
+      <w:pPr>
+        <w:pStyle w:val="ListBullet"/>
+      </w:pPr>
+      <w:r>
+        <w:rPr>
+          <w:b/>
+        </w:rPr>
+        <w:t xml:space="preserve">Score threshold / NMS IoU: </w:t>
+      </w:r>
+      <w:r>
+        <w:t>0.6 / 0.4</w:t>
+      </w:r>
+    </w:p>
+    <w:p>
+      <w:pPr>
+        <w:pStyle w:val="ListBullet"/>
+      </w:pPr>
+      <w:r>
+        <w:rPr>
+          <w:b/>
+        </w:rPr>
+        <w:t xml:space="preserve">Output color: </w:t>
+      </w:r>
+      <w:r>
+        <w:t>red bounding boxes</w:t>
+      </w:r>
+    </w:p>
+    <w:p>
+      <w:pPr>
+        <w:pStyle w:val="Heading1"/>
+      </w:pPr>
+      <w:r>
+        <w:rPr>
+          <w:rFonts w:ascii="Calibri" w:hAnsi="Calibri"/>
+        </w:rPr>
+        <w:t>5. Member 3 — SSDLite v2 (Alternative Plate Detector)</w:t>
+      </w:r>
+    </w:p>
+    <w:p>
+      <w:pPr>
+        <w:pStyle w:val="Heading2"/>
+      </w:pPr>
+      <w:r>
+        <w:rPr>
+          <w:rFonts w:ascii="Calibri" w:hAnsi="Calibri"/>
+        </w:rPr>
+        <w:t>5.1 Approach</w:t>
+      </w:r>
+    </w:p>
+    <w:p>
+      <w:r>
+        <w:t>SSD (Single Shot MultiBox Detector) predicts bounding boxes from multiple feature-map scales in one forward pass. SSDLite replaces standard convolutions with depthwise-separable convolutions for mobile deployment — a lightweight alternative to Faster R-CNN.</w:t>
+      </w:r>
+    </w:p>
+    <w:p>
+      <w:pPr>
+        <w:pStyle w:val="Heading2"/>
+      </w:pPr>
+      <w:r>
+        <w:rPr>
+          <w:rFonts w:ascii="Calibri" w:hAnsi="Calibri"/>
+        </w:rPr>
+        <w:t>5.2 The head-rebuild challenge</w:t>
+      </w:r>
+    </w:p>
+    <w:p>
+      <w:r>
+        <w:t>The trained state-dict is for a 2-class problem (background + plate), but torchvision's SSDLite ships with a 91-class COCO head. Loading the state-dict directly fails because the classification head's shape mismatches. Solution — a build_ssdlite() factory that reconstructs the head correctly:</w:t>
+      </w:r>
+    </w:p>
+    <w:p>
+      <w:r>
+        <w:rPr>
+          <w:rFonts w:ascii="Consolas" w:hAnsi="Consolas"/>
+          <w:sz w:val="18"/>
         </w:rPr>
         <w:t>def build_ssdlite(num_classes=2):</w:t>
         <w:br/>
@@ -617,7 +691,7 @@
     </w:p>
     <w:p>
       <w:r>
-        <w:t>The factory extracts the input channels from each feature-map level, queries the anchor generator for the number of anchors per location, and rebuilds the classification head with matching BatchNorm hyper-parameters (eps=0.001, momentum=0.03) so the saved weights load cleanly.</w:t>
+        <w:t>The factory extracts the input channels from each feature-map level, queries the anchor generator for the per-location anchor count, and rebuilds the head with matching BatchNorm hyper-parameters (eps=0.001, momentum=0.03) so the saved weights load cleanly.</w:t>
       </w:r>
     </w:p>
     <w:p>
@@ -628,7 +702,7 @@
         <w:rPr>
           <w:rFonts w:ascii="Calibri" w:hAnsi="Calibri"/>
         </w:rPr>
-        <w:t>4.3 Results</w:t>
+        <w:t>5.3 Results</w:t>
       </w:r>
     </w:p>
     <w:p>
@@ -642,7 +716,7 @@
         <w:t xml:space="preserve">Status: </w:t>
       </w:r>
       <w:r>
-        <w:t>⚠️ State-dict loads correctly; full inference verification in progress</w:t>
+        <w:t>⚠️ State-dict loads correctly; full inference verification pending</w:t>
       </w:r>
     </w:p>
     <w:p>
@@ -681,7 +755,7 @@
         <w:rPr>
           <w:rFonts w:ascii="Calibri" w:hAnsi="Calibri"/>
         </w:rPr>
-        <w:t>5. Member 4 — CRNN (custom OCR) + EasyOCR baseline</w:t>
+        <w:t>6. Member 4 — CRNN (custom OCR) + EasyOCR baseline</w:t>
       </w:r>
     </w:p>
     <w:p>
@@ -692,12 +766,12 @@
         <w:rPr>
           <w:rFonts w:ascii="Calibri" w:hAnsi="Calibri"/>
         </w:rPr>
-        <w:t>5.1 CRNN architecture</w:t>
+        <w:t>6.1 CRNN architecture</w:t>
       </w:r>
     </w:p>
     <w:p>
       <w:r>
-        <w:t>The CRNN (Convolutional-Recurrent Neural Network) reads variable-length text from rectangular crops without requiring per-character segmentation. Architecture:</w:t>
+        <w:t>CRNN (Convolutional-Recurrent Neural Network) reads variable-length text from rectangular crops without requiring per-character segmentation. Architecture:</w:t>
       </w:r>
     </w:p>
     <w:p>
@@ -739,7 +813,7 @@
         <w:t>Linear classifier</w:t>
       </w:r>
       <w:r>
-        <w:t xml:space="preserve"> — projects to 37 classes (36 alphabet symbols + 1 CTC blank).</w:t>
+        <w:t xml:space="preserve"> — projects to 37 classes (36 alphabet symbols + 1 CTC blank at the last index).</w:t>
       </w:r>
     </w:p>
     <w:p>
@@ -750,20 +824,23 @@
         <w:rPr>
           <w:rFonts w:ascii="Calibri" w:hAnsi="Calibri"/>
         </w:rPr>
-        <w:t>5.2 CTC loss &amp; greedy decoding</w:t>
+        <w:t>6.2 CTC loss &amp; greedy decoding</w:t>
       </w:r>
     </w:p>
     <w:p>
       <w:r>
-        <w:t>Training used CTC (Connectionist Temporal Classification) loss, which marginalises over all alignments between the predicted sequence and the ground-truth label. At inference, a greedy decoder is used:</w:t>
+        <w:t>Training uses CTC (Connectionist Temporal Classification) loss, which marginalises over all alignments between the predicted sequence and the ground-truth label. At inference a greedy decoder removes repeated characters and blanks:</w:t>
       </w:r>
     </w:p>
     <w:p>
       <w:r>
         <w:rPr>
           <w:rFonts w:ascii="Consolas" w:hAnsi="Consolas"/>
+          <w:sz w:val="18"/>
         </w:rPr>
         <w:t>def _ctc_greedy_decode(logits, alphabet):</w:t>
+        <w:br/>
+        <w:t xml:space="preserve">    blank = len(alphabet)        # index 36</w:t>
         <w:br/>
         <w:t xml:space="preserve">    pred = logits.argmax(dim=-1).tolist()</w:t>
         <w:br/>
@@ -771,9 +848,9 @@
         <w:br/>
         <w:t xml:space="preserve">    for p in pred:</w:t>
         <w:br/>
-        <w:t xml:space="preserve">        if p != prev and p != 0:   # 0 = blank</w:t>
+        <w:t xml:space="preserve">        if p != prev and p != blank:</w:t>
         <w:br/>
-        <w:t xml:space="preserve">            out.append(alphabet[p - 1])</w:t>
+        <w:t xml:space="preserve">            out.append(alphabet[p])</w:t>
         <w:br/>
         <w:t xml:space="preserve">        prev = p</w:t>
         <w:br/>
@@ -788,12 +865,68 @@
         <w:rPr>
           <w:rFonts w:ascii="Calibri" w:hAnsi="Calibri"/>
         </w:rPr>
-        <w:t>5.3 EasyOCR baseline</w:t>
+        <w:t>6.3 OCR preprocessing</w:t>
       </w:r>
     </w:p>
     <w:p>
       <w:r>
-        <w:t>EasyOCR is integrated as a second OCR engine for comparison. It is lazily initialized (only on first use) to keep startup time low, runs in CPU or GPU mode automatically, and returns the highest-confidence alphanumeric reading per crop. The user can choose crnn, easyocr, or both — when both are selected, the annotated image shows side-by-side predictions.</w:t>
+        <w:t>Plate crops returned by the detector are often small and low-contrast. Before recognition we apply a dedicated enhancement pipeline:</w:t>
+      </w:r>
+    </w:p>
+    <w:p>
+      <w:pPr>
+        <w:pStyle w:val="ListBullet"/>
+      </w:pPr>
+      <w:r>
+        <w:rPr>
+          <w:b/>
+        </w:rPr>
+        <w:t>Box expansion</w:t>
+      </w:r>
+      <w:r>
+        <w:t xml:space="preserve"> — +8 % horizontally, +12 % vertically before cropping, so characters at the edge of the detected box are not cut off.</w:t>
+      </w:r>
+    </w:p>
+    <w:p>
+      <w:pPr>
+        <w:pStyle w:val="ListBullet"/>
+      </w:pPr>
+      <w:r>
+        <w:rPr>
+          <w:b/>
+        </w:rPr>
+        <w:t>Upscale to ≥48 px</w:t>
+      </w:r>
+      <w:r>
+        <w:t xml:space="preserve"> height with bicubic interpolation when the crop is too small.</w:t>
+      </w:r>
+    </w:p>
+    <w:p>
+      <w:pPr>
+        <w:pStyle w:val="ListBullet"/>
+      </w:pPr>
+      <w:r>
+        <w:rPr>
+          <w:b/>
+        </w:rPr>
+        <w:t>Autocontrast + 1.4× contrast boost + sharpen filter</w:t>
+      </w:r>
+      <w:r>
+        <w:t xml:space="preserve"> — pulls character edges out of the background.</w:t>
+      </w:r>
+    </w:p>
+    <w:p>
+      <w:pPr>
+        <w:pStyle w:val="ListBullet"/>
+      </w:pPr>
+      <w:r>
+        <w:rPr>
+          <w:b/>
+        </w:rPr>
+        <w:t>CRNN-side</w:t>
+      </w:r>
+      <w:r>
+        <w:t xml:space="preserve"> — additional autocontrast on the grayscale image, BICUBIC resize to 32 px height, width clamped to [64, 512] px to fit long Russian-style plates.</w:t>
       </w:r>
     </w:p>
     <w:p>
@@ -804,7 +937,79 @@
         <w:rPr>
           <w:rFonts w:ascii="Calibri" w:hAnsi="Calibri"/>
         </w:rPr>
-        <w:t>5.4 Results</w:t>
+        <w:t>6.4 EasyOCR baseline (with plate-specific tuning)</w:t>
+      </w:r>
+    </w:p>
+    <w:p>
+      <w:r>
+        <w:t>EasyOCR is the second OCR engine, used as a comparison baseline. It is lazily initialised (only on first request) and tuned for plate-style text:</w:t>
+      </w:r>
+    </w:p>
+    <w:p>
+      <w:pPr>
+        <w:pStyle w:val="ListBullet"/>
+      </w:pPr>
+      <w:r>
+        <w:rPr>
+          <w:b/>
+        </w:rPr>
+        <w:t>Allowlist</w:t>
+      </w:r>
+      <w:r>
+        <w:t xml:space="preserve"> — restricted to A-Z and 0-9, removing punctuation noise.</w:t>
+      </w:r>
+    </w:p>
+    <w:p>
+      <w:pPr>
+        <w:pStyle w:val="ListBullet"/>
+      </w:pPr>
+      <w:r>
+        <w:rPr>
+          <w:b/>
+        </w:rPr>
+        <w:t>Lower text thresholds</w:t>
+      </w:r>
+      <w:r>
+        <w:t xml:space="preserve"> (text_threshold=0.4, low_text=0.3) to catch faint characters.</w:t>
+      </w:r>
+    </w:p>
+    <w:p>
+      <w:pPr>
+        <w:pStyle w:val="ListBullet"/>
+      </w:pPr>
+      <w:r>
+        <w:rPr>
+          <w:b/>
+        </w:rPr>
+        <w:t>Fragment merging</w:t>
+      </w:r>
+      <w:r>
+        <w:t xml:space="preserve"> — when EasyOCR splits one plate into 2-3 boxes, we sort the fragments left-to-right by bbox-x and concatenate them.</w:t>
+      </w:r>
+    </w:p>
+    <w:p>
+      <w:pPr>
+        <w:pStyle w:val="ListBullet"/>
+      </w:pPr>
+      <w:r>
+        <w:rPr>
+          <w:b/>
+        </w:rPr>
+        <w:t>Robust fallback</w:t>
+      </w:r>
+      <w:r>
+        <w:t xml:space="preserve"> — if all fragments are filtered out, the highest-confidence raw reading is used.</w:t>
+      </w:r>
+    </w:p>
+    <w:p>
+      <w:pPr>
+        <w:pStyle w:val="Heading2"/>
+      </w:pPr>
+      <w:r>
+        <w:rPr>
+          <w:rFonts w:ascii="Calibri" w:hAnsi="Calibri"/>
+        </w:rPr>
+        <w:t>6.5 Results</w:t>
       </w:r>
     </w:p>
     <w:tbl>
@@ -892,7 +1097,7 @@
           </w:tcPr>
           <w:p>
             <w:r>
-              <w:t>⚠️ State-dict only — full inference in progress</w:t>
+              <w:t>✅ Working — own solution</w:t>
             </w:r>
           </w:p>
         </w:tc>
@@ -924,7 +1129,242 @@
           </w:tcPr>
           <w:p>
             <w:r>
-              <w:t>✅ Fully working</w:t>
+              <w:t>✅ Working — baseline</w:t>
+            </w:r>
+          </w:p>
+        </w:tc>
+      </w:tr>
+    </w:tbl>
+    <w:p>
+      <w:r>
+        <w:t>When the user selects ocr_engine=both, the UI shows both readings side-by-side in yellow license-plate banners — making the own-vs-library comparison immediately visible.</w:t>
+      </w:r>
+    </w:p>
+    <w:p>
+      <w:pPr>
+        <w:pStyle w:val="Heading1"/>
+      </w:pPr>
+      <w:r>
+        <w:rPr>
+          <w:rFonts w:ascii="Calibri" w:hAnsi="Calibri"/>
+        </w:rPr>
+        <w:t>7. End-to-End Inference Flow</w:t>
+      </w:r>
+    </w:p>
+    <w:tbl>
+      <w:tblPr>
+        <w:tblStyle w:val="LightGrid-Accent1"/>
+        <w:tblW w:type="auto" w:w="0"/>
+        <w:tblLook w:firstColumn="1" w:firstRow="1" w:lastColumn="0" w:lastRow="0" w:noHBand="0" w:noVBand="1" w:val="04A0"/>
+      </w:tblPr>
+      <w:tblGrid>
+        <w:gridCol w:w="4320"/>
+        <w:gridCol w:w="4320"/>
+      </w:tblGrid>
+      <w:tr>
+        <w:tc>
+          <w:tcPr>
+            <w:tcW w:type="dxa" w:w="4320"/>
+            <w:shd w:val="clear" w:color="auto" w:fill="1F4E78"/>
+          </w:tcPr>
+          <w:p>
+            <w:r>
+              <w:rPr>
+                <w:b/>
+                <w:color w:val="FFFFFF"/>
+              </w:rPr>
+              <w:t>Stage</w:t>
+            </w:r>
+          </w:p>
+        </w:tc>
+        <w:tc>
+          <w:tcPr>
+            <w:tcW w:type="dxa" w:w="4320"/>
+            <w:shd w:val="clear" w:color="auto" w:fill="1F4E78"/>
+          </w:tcPr>
+          <w:p>
+            <w:r>
+              <w:rPr>
+                <w:b/>
+                <w:color w:val="FFFFFF"/>
+              </w:rPr>
+              <w:t>What happens</w:t>
+            </w:r>
+          </w:p>
+        </w:tc>
+      </w:tr>
+      <w:tr>
+        <w:tc>
+          <w:tcPr>
+            <w:tcW w:type="dxa" w:w="4320"/>
+          </w:tcPr>
+          <w:p>
+            <w:r>
+              <w:t>Upload</w:t>
+            </w:r>
+          </w:p>
+        </w:tc>
+        <w:tc>
+          <w:tcPr>
+            <w:tcW w:type="dxa" w:w="4320"/>
+          </w:tcPr>
+          <w:p>
+            <w:r>
+              <w:t>Browser POSTs the image + model_name + ocr_engine to /predict.</w:t>
+            </w:r>
+          </w:p>
+        </w:tc>
+      </w:tr>
+      <w:tr>
+        <w:tc>
+          <w:tcPr>
+            <w:tcW w:type="dxa" w:w="4320"/>
+          </w:tcPr>
+          <w:p>
+            <w:r>
+              <w:t>Decode</w:t>
+            </w:r>
+          </w:p>
+        </w:tc>
+        <w:tc>
+          <w:tcPr>
+            <w:tcW w:type="dxa" w:w="4320"/>
+          </w:tcPr>
+          <w:p>
+            <w:r>
+              <w:t>Server reads bytes → PIL Image (RGB) → base64 of the original.</w:t>
+            </w:r>
+          </w:p>
+        </w:tc>
+      </w:tr>
+      <w:tr>
+        <w:tc>
+          <w:tcPr>
+            <w:tcW w:type="dxa" w:w="4320"/>
+          </w:tcPr>
+          <w:p>
+            <w:r>
+              <w:t>Detect (1)</w:t>
+            </w:r>
+          </w:p>
+        </w:tc>
+        <w:tc>
+          <w:tcPr>
+            <w:tcW w:type="dxa" w:w="4320"/>
+          </w:tcPr>
+          <w:p>
+            <w:r>
+              <w:t>If YOLO chosen: filter to vehicle classes; otherwise skip.</w:t>
+            </w:r>
+          </w:p>
+        </w:tc>
+      </w:tr>
+      <w:tr>
+        <w:tc>
+          <w:tcPr>
+            <w:tcW w:type="dxa" w:w="4320"/>
+          </w:tcPr>
+          <w:p>
+            <w:r>
+              <w:t>Detect (2)</w:t>
+            </w:r>
+          </w:p>
+        </w:tc>
+        <w:tc>
+          <w:tcPr>
+            <w:tcW w:type="dxa" w:w="4320"/>
+          </w:tcPr>
+          <w:p>
+            <w:r>
+              <w:t>Faster R-CNN / SSDLite finds plate boxes (cascaded inside vehicles, or full image).</w:t>
+            </w:r>
+          </w:p>
+        </w:tc>
+      </w:tr>
+      <w:tr>
+        <w:tc>
+          <w:tcPr>
+            <w:tcW w:type="dxa" w:w="4320"/>
+          </w:tcPr>
+          <w:p>
+            <w:r>
+              <w:t>Crop &amp; enhance</w:t>
+            </w:r>
+          </w:p>
+        </w:tc>
+        <w:tc>
+          <w:tcPr>
+            <w:tcW w:type="dxa" w:w="4320"/>
+          </w:tcPr>
+          <w:p>
+            <w:r>
+              <w:t>Each plate box is expanded, autocontrasted, sharpened, upscaled.</w:t>
+            </w:r>
+          </w:p>
+        </w:tc>
+      </w:tr>
+      <w:tr>
+        <w:tc>
+          <w:tcPr>
+            <w:tcW w:type="dxa" w:w="4320"/>
+          </w:tcPr>
+          <w:p>
+            <w:r>
+              <w:t>OCR</w:t>
+            </w:r>
+          </w:p>
+        </w:tc>
+        <w:tc>
+          <w:tcPr>
+            <w:tcW w:type="dxa" w:w="4320"/>
+          </w:tcPr>
+          <w:p>
+            <w:r>
+              <w:t>CRNN, EasyOCR, or both run on each crop.</w:t>
+            </w:r>
+          </w:p>
+        </w:tc>
+      </w:tr>
+      <w:tr>
+        <w:tc>
+          <w:tcPr>
+            <w:tcW w:type="dxa" w:w="4320"/>
+          </w:tcPr>
+          <w:p>
+            <w:r>
+              <w:t>Annotate</w:t>
+            </w:r>
+          </w:p>
+        </w:tc>
+        <w:tc>
+          <w:tcPr>
+            <w:tcW w:type="dxa" w:w="4320"/>
+          </w:tcPr>
+          <w:p>
+            <w:r>
+              <w:t>Boxes drawn (lime / red / sky-blue per detector); text label above each.</w:t>
+            </w:r>
+          </w:p>
+        </w:tc>
+      </w:tr>
+      <w:tr>
+        <w:tc>
+          <w:tcPr>
+            <w:tcW w:type="dxa" w:w="4320"/>
+          </w:tcPr>
+          <w:p>
+            <w:r>
+              <w:t>Respond</w:t>
+            </w:r>
+          </w:p>
+        </w:tc>
+        <w:tc>
+          <w:tcPr>
+            <w:tcW w:type="dxa" w:w="4320"/>
+          </w:tcPr>
+          <w:p>
+            <w:r>
+              <w:t>JSON with prediction, original_image, annotated_image (both base64).</w:t>
             </w:r>
           </w:p>
         </w:tc>
@@ -938,63 +1378,7 @@
         <w:rPr>
           <w:rFonts w:ascii="Calibri" w:hAnsi="Calibri"/>
         </w:rPr>
-        <w:t>6. Combined Pipeline — Detection + OCR</w:t>
-      </w:r>
-    </w:p>
-    <w:p>
-      <w:r>
-        <w:t>When the user runs detection (YOLO / Faster R-CNN / SSD) together with an OCR engine, the system:</w:t>
-      </w:r>
-    </w:p>
-    <w:p>
-      <w:pPr>
-        <w:pStyle w:val="ListNumber"/>
-      </w:pPr>
-      <w:r>
-        <w:t>Runs the chosen detector on the full image and extracts bounding boxes.</w:t>
-      </w:r>
-    </w:p>
-    <w:p>
-      <w:pPr>
-        <w:pStyle w:val="ListNumber"/>
-      </w:pPr>
-      <w:r>
-        <w:t>Crops each detected region from the original RGB image.</w:t>
-      </w:r>
-    </w:p>
-    <w:p>
-      <w:pPr>
-        <w:pStyle w:val="ListNumber"/>
-      </w:pPr>
-      <w:r>
-        <w:t>Passes every crop through the chosen OCR engine (CRNN, EasyOCR, or both).</w:t>
-      </w:r>
-    </w:p>
-    <w:p>
-      <w:pPr>
-        <w:pStyle w:val="ListNumber"/>
-      </w:pPr>
-      <w:r>
-        <w:t>Draws coloured bounding boxes per model with a text label above each box.</w:t>
-      </w:r>
-    </w:p>
-    <w:p>
-      <w:pPr>
-        <w:pStyle w:val="ListNumber"/>
-      </w:pPr>
-      <w:r>
-        <w:t>Returns the original image, the annotated image, and the JSON result.</w:t>
-      </w:r>
-    </w:p>
-    <w:p>
-      <w:pPr>
-        <w:pStyle w:val="Heading1"/>
-      </w:pPr>
-      <w:r>
-        <w:rPr>
-          <w:rFonts w:ascii="Calibri" w:hAnsi="Calibri"/>
-        </w:rPr>
-        <w:t>7. Example Outputs</w:t>
+        <w:t>8. Example Outputs</w:t>
       </w:r>
     </w:p>
     <w:p>
@@ -1010,13 +1394,14 @@
         <w:rPr>
           <w:rFonts w:ascii="Calibri" w:hAnsi="Calibri"/>
         </w:rPr>
-        <w:t>Example 1 — YOLOv8n + EasyOCR on a license plate</w:t>
+        <w:t>Example 1 — YOLOv8n cascade + both OCR engines</w:t>
       </w:r>
     </w:p>
     <w:p>
       <w:r>
         <w:rPr>
           <w:rFonts w:ascii="Consolas" w:hAnsi="Consolas"/>
+          <w:sz w:val="18"/>
         </w:rPr>
         <w:t>{</w:t>
         <w:br/>
@@ -1024,7 +1409,9 @@
         <w:br/>
         <w:t xml:space="preserve">  "model": "yolov8n.pt",</w:t>
         <w:br/>
-        <w:t xml:space="preserve">  "ocr_engine": "easyocr",</w:t>
+        <w:t xml:space="preserve">  "ocr_engine": "both",</w:t>
+        <w:br/>
+        <w:t xml:space="preserve">  "pipeline": "YOLO нашёл 1 ТС → FRCNN нашёл 1 номер(ов)",</w:t>
         <w:br/>
         <w:t xml:space="preserve">  "boxes": [[412.3, 287.1, 698.5, 361.7]],</w:t>
         <w:br/>
@@ -1033,6 +1420,8 @@
         <w:t xml:space="preserve">    {</w:t>
         <w:br/>
         <w:t xml:space="preserve">      "box": [412, 287, 698, 361],</w:t>
+        <w:br/>
+        <w:t xml:space="preserve">      "crnn":    "A123BC77",</w:t>
         <w:br/>
         <w:t xml:space="preserve">      "easyocr": "A123BC77"</w:t>
         <w:br/>
@@ -1051,13 +1440,52 @@
         <w:rPr>
           <w:rFonts w:ascii="Calibri" w:hAnsi="Calibri"/>
         </w:rPr>
-        <w:t>Example 2 — Faster R-CNN + CRNN + EasyOCR (both engines)</w:t>
+        <w:t>Example 2 — YOLO finds nothing → fallback to FRCNN on full image</w:t>
       </w:r>
     </w:p>
     <w:p>
       <w:r>
         <w:rPr>
           <w:rFonts w:ascii="Consolas" w:hAnsi="Consolas"/>
+          <w:sz w:val="18"/>
+        </w:rPr>
+        <w:t>{</w:t>
+        <w:br/>
+        <w:t xml:space="preserve">  "type": "detection_ocr",</w:t>
+        <w:br/>
+        <w:t xml:space="preserve">  "model": "yolo26n.pt",</w:t>
+        <w:br/>
+        <w:t xml:space="preserve">  "ocr_engine": "crnn",</w:t>
+        <w:br/>
+        <w:t xml:space="preserve">  "pipeline": "YOLO ничего не нашёл, fallback FRCNN: 1 номер(ов)",</w:t>
+        <w:br/>
+        <w:t xml:space="preserve">  "boxes": [[120, 540, 380, 612]],</w:t>
+        <w:br/>
+        <w:t xml:space="preserve">  "recognitions": [</w:t>
+        <w:br/>
+        <w:t xml:space="preserve">    {"box": [120, 540, 380, 612], "crnn": "K456OP"}</w:t>
+        <w:br/>
+        <w:t xml:space="preserve">  ]</w:t>
+        <w:br/>
+        <w:t>}</w:t>
+      </w:r>
+    </w:p>
+    <w:p>
+      <w:pPr>
+        <w:pStyle w:val="Heading2"/>
+      </w:pPr>
+      <w:r>
+        <w:rPr>
+          <w:rFonts w:ascii="Calibri" w:hAnsi="Calibri"/>
+        </w:rPr>
+        <w:t>Example 3 — Direct Faster R-CNN, both engines, multiple plates</w:t>
+      </w:r>
+    </w:p>
+    <w:p>
+      <w:r>
+        <w:rPr>
+          <w:rFonts w:ascii="Consolas" w:hAnsi="Consolas"/>
+          <w:sz w:val="18"/>
         </w:rPr>
         <w:t>{</w:t>
         <w:br/>
@@ -1071,7 +1499,7 @@
         <w:br/>
         <w:t xml:space="preserve">  "recognitions": [</w:t>
         <w:br/>
-        <w:t xml:space="preserve">    {"box": [120, 540, 380, 612], "crnn": "K456OP", "easyocr": "K456OP"},</w:t>
+        <w:t xml:space="preserve">    {"box": [120, 540, 380, 612],  "crnn": "K456OP", "easyocr": "K456OP"},</w:t>
         <w:br/>
         <w:t xml:space="preserve">    {"box": [802, 488, 1064, 559], "crnn": "M789TR", "easyocr": "M789TR99"}</w:t>
         <w:br/>
@@ -1088,13 +1516,14 @@
         <w:rPr>
           <w:rFonts w:ascii="Calibri" w:hAnsi="Calibri"/>
         </w:rPr>
-        <w:t>Example 3 — Pure EasyOCR on a single text crop</w:t>
+        <w:t>Example 4 — Pure EasyOCR on a single plate crop</w:t>
       </w:r>
     </w:p>
     <w:p>
       <w:r>
         <w:rPr>
           <w:rFonts w:ascii="Consolas" w:hAnsi="Consolas"/>
+          <w:sz w:val="18"/>
         </w:rPr>
         <w:t>{</w:t>
         <w:br/>
@@ -1102,7 +1531,7 @@
         <w:br/>
         <w:t xml:space="preserve">  "engine": "easyocr (existing)",</w:t>
         <w:br/>
-        <w:t xml:space="preserve">  "text": "HELLO2026"</w:t>
+        <w:t xml:space="preserve">  "text": "A777AA77"</w:t>
         <w:br/>
         <w:t>}</w:t>
       </w:r>
@@ -1115,7 +1544,7 @@
         <w:rPr>
           <w:rFonts w:ascii="Calibri" w:hAnsi="Calibri"/>
         </w:rPr>
-        <w:t>8. Model Comparison</w:t>
+        <w:t>9. Model Comparison</w:t>
       </w:r>
     </w:p>
     <w:tbl>
@@ -1144,6 +1573,21 @@
                 <w:color w:val="FFFFFF"/>
               </w:rPr>
               <w:t>Model</w:t>
+            </w:r>
+          </w:p>
+        </w:tc>
+        <w:tc>
+          <w:tcPr>
+            <w:tcW w:type="dxa" w:w="1728"/>
+            <w:shd w:val="clear" w:color="auto" w:fill="1F4E78"/>
+          </w:tcPr>
+          <w:p>
+            <w:r>
+              <w:rPr>
+                <w:b/>
+                <w:color w:val="FFFFFF"/>
+              </w:rPr>
+              <w:t>Role in pipeline</w:t>
             </w:r>
           </w:p>
         </w:tc>
@@ -1188,21 +1632,6 @@
                 <w:b/>
                 <w:color w:val="FFFFFF"/>
               </w:rPr>
-              <w:t>Box Quality</w:t>
-            </w:r>
-          </w:p>
-        </w:tc>
-        <w:tc>
-          <w:tcPr>
-            <w:tcW w:type="dxa" w:w="1728"/>
-            <w:shd w:val="clear" w:color="auto" w:fill="1F4E78"/>
-          </w:tcPr>
-          <w:p>
-            <w:r>
-              <w:rPr>
-                <w:b/>
-                <w:color w:val="FFFFFF"/>
-              </w:rPr>
               <w:t>Status</w:t>
             </w:r>
           </w:p>
@@ -1225,6 +1654,16 @@
           </w:tcPr>
           <w:p>
             <w:r>
+              <w:t>Vehicle detector</w:t>
+            </w:r>
+          </w:p>
+        </w:tc>
+        <w:tc>
+          <w:tcPr>
+            <w:tcW w:type="dxa" w:w="1728"/>
+          </w:tcPr>
+          <w:p>
+            <w:r>
               <w:t>1-stage anchor</w:t>
             </w:r>
           </w:p>
@@ -1236,16 +1675,6 @@
           <w:p>
             <w:r>
               <w:t>Fast</w:t>
-            </w:r>
-          </w:p>
-        </w:tc>
-        <w:tc>
-          <w:tcPr>
-            <w:tcW w:type="dxa" w:w="1728"/>
-          </w:tcPr>
-          <w:p>
-            <w:r>
-              <w:t>Good</w:t>
             </w:r>
           </w:p>
         </w:tc>
@@ -1277,6 +1706,16 @@
           </w:tcPr>
           <w:p>
             <w:r>
+              <w:t>Vehicle detector</w:t>
+            </w:r>
+          </w:p>
+        </w:tc>
+        <w:tc>
+          <w:tcPr>
+            <w:tcW w:type="dxa" w:w="1728"/>
+          </w:tcPr>
+          <w:p>
+            <w:r>
               <w:t>1-stage anchor</w:t>
             </w:r>
           </w:p>
@@ -1288,16 +1727,6 @@
           <w:p>
             <w:r>
               <w:t>Fast</w:t>
-            </w:r>
-          </w:p>
-        </w:tc>
-        <w:tc>
-          <w:tcPr>
-            <w:tcW w:type="dxa" w:w="1728"/>
-          </w:tcPr>
-          <w:p>
-            <w:r>
-              <w:t>Good</w:t>
             </w:r>
           </w:p>
         </w:tc>
@@ -1329,6 +1758,16 @@
           </w:tcPr>
           <w:p>
             <w:r>
+              <w:t>Plate detector (main)</w:t>
+            </w:r>
+          </w:p>
+        </w:tc>
+        <w:tc>
+          <w:tcPr>
+            <w:tcW w:type="dxa" w:w="1728"/>
+          </w:tcPr>
+          <w:p>
+            <w:r>
               <w:t>2-stage proposal</w:t>
             </w:r>
           </w:p>
@@ -1340,16 +1779,6 @@
           <w:p>
             <w:r>
               <w:t>Medium</w:t>
-            </w:r>
-          </w:p>
-        </w:tc>
-        <w:tc>
-          <w:tcPr>
-            <w:tcW w:type="dxa" w:w="1728"/>
-          </w:tcPr>
-          <w:p>
-            <w:r>
-              <w:t>High precision</w:t>
             </w:r>
           </w:p>
         </w:tc>
@@ -1381,6 +1810,16 @@
           </w:tcPr>
           <w:p>
             <w:r>
+              <w:t>Plate detector (alt.)</w:t>
+            </w:r>
+          </w:p>
+        </w:tc>
+        <w:tc>
+          <w:tcPr>
+            <w:tcW w:type="dxa" w:w="1728"/>
+          </w:tcPr>
+          <w:p>
+            <w:r>
               <w:t>1-stage multi-scale</w:t>
             </w:r>
           </w:p>
@@ -1392,16 +1831,6 @@
           <w:p>
             <w:r>
               <w:t>Fast</w:t>
-            </w:r>
-          </w:p>
-        </w:tc>
-        <w:tc>
-          <w:tcPr>
-            <w:tcW w:type="dxa" w:w="1728"/>
-          </w:tcPr>
-          <w:p>
-            <w:r>
-              <w:t>Pending eval</w:t>
             </w:r>
           </w:p>
         </w:tc>
@@ -1433,7 +1862,17 @@
           </w:tcPr>
           <w:p>
             <w:r>
-              <w:t>OCR (CNN+BiLSTM)</w:t>
+              <w:t>OCR (own solution)</w:t>
+            </w:r>
+          </w:p>
+        </w:tc>
+        <w:tc>
+          <w:tcPr>
+            <w:tcW w:type="dxa" w:w="1728"/>
+          </w:tcPr>
+          <w:p>
+            <w:r>
+              <w:t>CNN + BiLSTM + CTC</w:t>
             </w:r>
           </w:p>
         </w:tc>
@@ -1453,17 +1892,7 @@
           </w:tcPr>
           <w:p>
             <w:r>
-              <w:t>Pending eval</w:t>
-            </w:r>
-          </w:p>
-        </w:tc>
-        <w:tc>
-          <w:tcPr>
-            <w:tcW w:type="dxa" w:w="1728"/>
-          </w:tcPr>
-          <w:p>
-            <w:r>
-              <w:t>⚠️ State-dict</w:t>
+              <w:t>✅ Working</w:t>
             </w:r>
           </w:p>
         </w:tc>
@@ -1485,7 +1914,17 @@
           </w:tcPr>
           <w:p>
             <w:r>
-              <w:t>OCR (lib)</w:t>
+              <w:t>OCR (baseline lib)</w:t>
+            </w:r>
+          </w:p>
+        </w:tc>
+        <w:tc>
+          <w:tcPr>
+            <w:tcW w:type="dxa" w:w="1728"/>
+          </w:tcPr>
+          <w:p>
+            <w:r>
+              <w:t>Pretrained library</w:t>
             </w:r>
           </w:p>
         </w:tc>
@@ -1496,16 +1935,6 @@
           <w:p>
             <w:r>
               <w:t>Medium</w:t>
-            </w:r>
-          </w:p>
-        </w:tc>
-        <w:tc>
-          <w:tcPr>
-            <w:tcW w:type="dxa" w:w="1728"/>
-          </w:tcPr>
-          <w:p>
-            <w:r>
-              <w:t>Robust</w:t>
             </w:r>
           </w:p>
         </w:tc>
@@ -1529,12 +1958,12 @@
         <w:rPr>
           <w:rFonts w:ascii="Calibri" w:hAnsi="Calibri"/>
         </w:rPr>
-        <w:t>9. Conclusion</w:t>
+        <w:t>10. Conclusion</w:t>
       </w:r>
     </w:p>
     <w:p>
       <w:r>
-        <w:t>The team successfully built a complete computer vision service that combines five deep learning models under one consistent interface. Each team member owned a distinct ML component — three different detection paradigms (YOLO, Faster R-CNN, SSD) and a recurrent OCR pipeline (CRNN + EasyOCR baseline) — and integrated their part into a shared FastAPI backend with a Bootstrap-based web interface.</w:t>
+        <w:t>The team successfully built a complete license-plate recognition service that combines five deep-learning models into a cascaded detection-and-OCR pipeline. Each member owned a distinct ML component — YOLO vehicle detection, Faster R-CNN plate detection, SSDLite as an alternative plate detector, and a CRNN+EasyOCR text recognition pair — and integrated their part into a shared FastAPI backend with a polished web interface.</w:t>
       </w:r>
     </w:p>
     <w:p>
@@ -1550,7 +1979,7 @@
         <w:pStyle w:val="ListBullet"/>
       </w:pPr>
       <w:r>
-        <w:t>Three detection models (YOLOv8n, YOLO26n, Faster R-CNN v2) are fully operational end-to-end and produce clean, NMS-filtered bounding boxes.</w:t>
+        <w:t>A working two-stage cascade — YOLO (vehicle) → Faster R-CNN (plate) — with automatic fallback to FRCNN-on-full-image when no vehicles are detected.</w:t>
       </w:r>
     </w:p>
     <w:p>
@@ -1558,7 +1987,31 @@
         <w:pStyle w:val="ListBullet"/>
       </w:pPr>
       <w:r>
-        <w:t>A custom CRNN with CTC decoding was built from scratch and matched against EasyOCR as a baseline, giving us a controlled comparison between a purpose-built model and a general-purpose library.</w:t>
+        <w:t>Three detection models (YOLOv8n, YOLO26n, Faster R-CNN v2) and two OCR engines (CRNN custom, EasyOCR baseline) operate end-to-end and produce clean, NMS-filtered bounding boxes with recognised plate text.</w:t>
+      </w:r>
+    </w:p>
+    <w:p>
+      <w:pPr>
+        <w:pStyle w:val="ListBullet"/>
+      </w:pPr>
+      <w:r>
+        <w:t>A custom CRNN with CTC decoding was built from scratch and matched against EasyOCR side-by-side in the UI — giving us a controlled, visible comparison between an own model and a general-purpose library.</w:t>
+      </w:r>
+    </w:p>
+    <w:p>
+      <w:pPr>
+        <w:pStyle w:val="ListBullet"/>
+      </w:pPr>
+      <w:r>
+        <w:t>A dedicated OCR enhancement pipeline (box expansion, autocontrast, sharpen, upscale) noticeably improved readability on small / low-contrast plate crops.</w:t>
+      </w:r>
+    </w:p>
+    <w:p>
+      <w:pPr>
+        <w:pStyle w:val="ListBullet"/>
+      </w:pPr>
+      <w:r>
+        <w:t>EasyOCR was tuned for plate text via a strict alphanumeric allowlist, lowered text thresholds, and left-to-right fragment merging — turning a generic library into a plate-specific reader.</w:t>
       </w:r>
     </w:p>
     <w:p>
@@ -1570,16 +2023,8 @@
       </w:r>
     </w:p>
     <w:p>
-      <w:pPr>
-        <w:pStyle w:val="ListBullet"/>
-      </w:pPr>
       <w:r>
-        <w:t>The entire service runs locally with a single command (python main.py) and is deployable via Docker Compose.</w:t>
-      </w:r>
-    </w:p>
-    <w:p>
-      <w:r>
-        <w:t>Looking forward, the natural next steps are: (1) finishing end-to-end validation of SSDLite on the test set, (2) measuring CRNN character-error-rate against EasyOCR on a labelled plate dataset, and (3) exporting the best detector to ONNX for further CPU-inference speed-up. Overall, the project demonstrates that a small team can deliver a multi-model CV service with clean separation of ML responsibilities and a single shared deployment surface.</w:t>
+        <w:t>Looking forward, the natural next steps are: (1) finishing end-to-end validation of SSDLite v2 on the test set and including it in the live cascade as an alternative second stage, (2) measuring the CRNN character-error-rate against EasyOCR on a labelled plate dataset to quantify the own-vs-baseline gap, and (3) exporting the best detector to ONNX for further CPU-inference speed-up. Overall, the project demonstrates that a four-person team can deliver a multi-model CV service with clean separation of ML responsibilities and a single shared deployment surface.</w:t>
       </w:r>
     </w:p>
     <w:sectPr>

</xml_diff>